<commit_message>
docs: Hoan thien bao cao chinh thuc (27 trang PDF+DOCX), cap nhat README va LOGBOOK day du 3 thanh vien, hinh anh minh chung thuc te, toi uu page break cac chuong va logo HUIT
</commit_message>
<xml_diff>
--- a/docs/BigData_nhom15_ChuanChinhThuc.docx
+++ b/docs/BigData_nhom15_ChuanChinhThuc.docx
@@ -3287,6 +3287,11 @@
       </w:r>
     </w:p>
     <w:p>
+      <w:r>
+        <w:br w:type="page"/>
+      </w:r>
+    </w:p>
+    <w:p>
       <w:pPr>
         <w:spacing w:before="280" w:after="120"/>
       </w:pPr>
@@ -4256,6 +4261,11 @@
           <w:sz w:val="24"/>
         </w:rPr>
         <w:t>D = supx | F1(x) – F2(x) |. Khi giá trị kiểm định p-value &lt; 0.01 và khoảng cách cực đại D &gt; 0.15, hệ thống khẳng định phân phối các đặc trưng giao dịch đã bị dịch chuyển có ý nghĩa thống kê.</w:t>
+      </w:r>
+    </w:p>
+    <w:p>
+      <w:r>
+        <w:br w:type="page"/>
       </w:r>
     </w:p>
     <w:p>
@@ -5572,6 +5582,11 @@
           <w:sz w:val="24"/>
         </w:rPr>
         <w:t>Bảng kết luận thẩm định trở thành nguồn nhãn vàng (Ground Truth) để Airflow định kỳ kiểm tra. Khi tích lũy đủ nhãn mới, DAG sẽ tự động kích hoạt tái huấn luyện mô hình mới và tự động chuyển đổi sang phiên bản tiếp theo.</w:t>
+      </w:r>
+    </w:p>
+    <w:p>
+      <w:r>
+        <w:br w:type="page"/>
       </w:r>
     </w:p>
     <w:p>
@@ -7075,6 +7090,11 @@
           <w:sz w:val="24"/>
         </w:rPr>
         <w:t>• DAG 4: gl_bao_tri: Chạy định kỳ lúc 2:00 AM Chủ Nhật, thực hiện lệnh `OPTIMIZE Z-ORDER BY (tai_khoan_nguon)` và `VACUUM RETAIN 168 HOURS` để dọn dẹp các tệp tin rác.</w:t>
+      </w:r>
+    </w:p>
+    <w:p>
+      <w:r>
+        <w:br w:type="page"/>
       </w:r>
     </w:p>
     <w:p>
@@ -9925,6 +9945,11 @@
       </w:r>
     </w:p>
     <w:p>
+      <w:r>
+        <w:br w:type="page"/>
+      </w:r>
+    </w:p>
+    <w:p>
       <w:pPr>
         <w:spacing w:before="280" w:after="120"/>
       </w:pPr>

</xml_diff>